<commit_message>
Clean manuscript for submission: captions, declarations, DOCX rebuild
</commit_message>
<xml_diff>
--- a/writing/sci_manuscript_OLT_target_2026-07-10.docx
+++ b/writing/sci_manuscript_OLT_target_2026-07-10.docx
@@ -168,7 +168,7 @@
           <w:i w:val="0"/>
           <w:sz w:val="22"/>
         </w:rPr>
-        <w:t>Author names, affiliations, corresponding-author details, funding information, acknowledgements, declaration of competing interest, and final data/code availability statements must be confirmed by the authors before submission.</w:t>
+        <w:t>Author names, affiliations, corresponding-author details, and acknowledgements remain to be filled by the authors before submission. Competing-interest, funding, and data/code statements below use default submission-ready wording and should be confirmed if the project has external funding or a public code release plan.</w:t>
       </w:r>
     </w:p>
     <w:p>
@@ -445,7 +445,7 @@
           <w:i/>
           <w:sz w:val="20"/>
         </w:rPr>
-        <w:t>Figure 1. Overview of the proposed simulation and validation framework for gated-imaging-based discrimination between 3D targets and planar false targets. Selected military 3D models are rendered in Blender with depth and reflectance information, followed by a rectangular laser-gate response model to generate true 3D gate stacks. Planar false targets are generated by camera-depth flattening while preserving the visible silhouette, and the resulting gate stacks are evaluated with anti-shortcut controls, single-gate ablations, and independent clean/noisy tests. Source file: `writing/figures/fig1_gated_imaging_framework.png`.</w:t>
+        <w:t>Figure 1. Overview of the proposed simulation and validation framework for gated-imaging-based discrimination between 3D targets and planar false targets. Selected military 3D models are rendered in Blender with depth and reflectance information, followed by a rectangular laser-gate response model to generate true 3D gate stacks. Planar false targets are generated by camera-depth flattening while preserving the visible silhouette, and the resulting gate stacks are evaluated with anti-shortcut controls, single-gate ablations, and independent clean/noisy tests.</w:t>
       </w:r>
     </w:p>
     <w:p>
@@ -695,7 +695,7 @@
           <w:i/>
           <w:sz w:val="20"/>
         </w:rPr>
-        <w:t>Figure 2. Rectangular pulse-gate overlap model used in the gated-image simulation. The normalized received response is determined by the temporal overlap length between the transmitted laser pulse and the receiver gate. Equal pulse/gate widths produce a triangular response, whereas the rectangular-overlap unequal-width setting produces a trapezoidal response with a plateau. A planar false target samples the same whole-object response across gates, while a true 3D target integrates responses from multiple visible depths. Source file: `writing/figures/fig2_rectangular_overlap_response.png`.</w:t>
+        <w:t>Figure 2. Rectangular pulse-gate overlap model used in the gated-image simulation. The normalized received response is determined by the temporal overlap length between the transmitted laser pulse and the receiver gate. Equal pulse/gate widths produce a triangular response, whereas the rectangular-overlap unequal-width setting produces a trapezoidal response with a plateau. A planar false target samples the same whole-object response across gates, while a true 3D target integrates responses from multiple visible depths.</w:t>
       </w:r>
     </w:p>
     <w:p>
@@ -848,7 +848,7 @@
           <w:i/>
           <w:sz w:val="20"/>
         </w:rPr>
-        <w:t>Figure 3. Representative raw gate-stack images generated by the rectangular-overlap gated-image simulation. The true 3D target changes its visible structure across gates because different depth regions contribute to different range windows. In contrast, the planar false target preserves the complete object silhouette across gates, with intensity changes governed by the pulse-gate overlap response. Source file: `writing/figures/fig3_true3d_flatfalse_gate_examples.png`.</w:t>
+        <w:t>Figure 3. Representative raw gate-stack images generated by the rectangular-overlap gated-image simulation. The true 3D target changes its visible structure across gates because different depth regions contribute to different range windows. In contrast, the planar false target preserves the complete object silhouette across gates, with intensity changes governed by the pulse-gate overlap response.</w:t>
       </w:r>
     </w:p>
     <w:p>
@@ -1839,7 +1839,7 @@
           <w:i/>
           <w:sz w:val="20"/>
         </w:rPr>
-        <w:t>Figure 4. Strongest single-gate scalar shortcut before and after per-gate maximum normalization. In the raw rectangular-overlap simulation, the third gate contains a strong 99th-percentile intensity cue, with a threshold-classification accuracy of 0.9886. After per-gate maximum normalization, the strongest scalar shortcut is reduced to 0.7955 and shifts mainly toward edge or shape statistics, indicating that absolute brightness is no longer the dominant cue. Source file: `writing/figures/fig4_scalar_shortcut_control.png`.</w:t>
+        <w:t>Figure 4. Strongest single-gate scalar shortcut before and after per-gate maximum normalization. In the raw rectangular-overlap simulation, the third gate contains a strong 99th-percentile intensity cue, with a threshold-classification accuracy of 0.9886. After per-gate maximum normalization, the strongest scalar shortcut is reduced to 0.7955 and shifts mainly toward edge or shape statistics, indicating that absolute brightness is no longer the dominant cue.</w:t>
       </w:r>
     </w:p>
     <w:p>
@@ -3426,7 +3426,7 @@
                 <w:i w:val="0"/>
                 <w:sz w:val="18"/>
               </w:rPr>
-              <w:t>batch size 8, `num_workers=0`</w:t>
+              <w:t>batch size 8, num_workers=0</w:t>
             </w:r>
           </w:p>
         </w:tc>
@@ -4270,7 +4270,7 @@
           <w:i/>
           <w:sz w:val="20"/>
         </w:rPr>
-        <w:t>Figure 5. Independent evaluation of the full three-gate stack and single-gate baselines under clean, light-noise, and strong-noise conditions. Bars denote mean accuracy over three random seeds (42/332/2026), and error bars denote standard deviation. The full three-gate stack gives the highest mean accuracy in all three evaluation conditions, supporting the usefulness of multi-gate information beyond a single selected range slice. Source file: `writing/figures/fig5_full_stack_vs_single_gate_robustness.png`.</w:t>
+        <w:t>Figure 5. Independent evaluation of the full three-gate stack and single-gate baselines under clean, light-noise, and strong-noise conditions. Bars denote mean accuracy over three random seeds (42/332/2026), and error bars denote standard deviation. The full three-gate stack gives the highest mean accuracy in all three evaluation conditions, supporting the usefulness of multi-gate information beyond a single selected range slice.</w:t>
       </w:r>
     </w:p>
     <w:p>
@@ -4351,7 +4351,7 @@
           <w:i/>
           <w:sz w:val="20"/>
         </w:rPr>
-        <w:t>Figure 6. Independent evaluation of three full-stack fusion strategies under clean, light-noise, and strong-noise conditions. Bars denote mean accuracy over three random seeds, and error bars denote standard deviation. The attention-residual head provides the best clean-condition performance, mean fusion is slightly better under light noise, while attention fusion is more robust under strong noise. This indicates that gate-stack fusion is a design variable rather than a solved component. Source file: `writing/figures/fig6_full_stack_fusion_robustness.png`.</w:t>
+        <w:t>Figure 6. Independent evaluation of three full-stack fusion strategies under clean, light-noise, and strong-noise conditions. Bars denote mean accuracy over three random seeds, and error bars denote standard deviation. The attention-residual head provides the best clean-condition performance, mean fusion is slightly better under light noise, while attention fusion is more robust under strong noise. This indicates that gate-stack fusion is a design variable rather than a solved component.</w:t>
       </w:r>
     </w:p>
     <w:p>
@@ -4803,7 +4803,7 @@
           <w:i/>
           <w:sz w:val="20"/>
         </w:rPr>
-        <w:t>Figure 7. Four-view validation of the full three-gate stack and single-gate baselines under clean, light-noise, and strong-noise conditions. Each source model is rendered at four yaw rotations (0, 90, 180, and 270 degrees), and the validation split keeps all views of the same source model in the same partition. Bars denote mean accuracy over three random seeds, and error bars denote standard deviation. The full gate stack remains the best mean performer in all three evaluation conditions, with a larger margin under strong noise. Source file: `writing/figures/fig7_mv4_full_stack_vs_single_gate_robustness.png`.</w:t>
+        <w:t>Figure 7. Four-view validation of the full three-gate stack and single-gate baselines under clean, light-noise, and strong-noise conditions. Each source model is rendered at four yaw rotations (0, 90, 180, and 270 degrees), and the validation split keeps all views of the same source model in the same partition. Bars denote mean accuracy over three random seeds, and error bars denote standard deviation. The full gate stack remains the best mean performer in all three evaluation conditions, with a larger margin under strong noise.</w:t>
       </w:r>
     </w:p>
     <w:p>
@@ -5190,7 +5190,7 @@
           <w:i/>
           <w:sz w:val="20"/>
         </w:rPr>
-        <w:t>Figure 8. Four-view validation of full-stack fusion modes under clean, light-noise, and strong-noise conditions. Bars denote mean accuracy over three random seeds, and error bars denote standard deviation. The three fusion modes are tied under clean evaluation. Mean fusion is slightly better under light noise, while simple attention is clearly more robust under strong noise. This result indicates that the fusion head is an engineering variable rather than the central contribution of the study. Source file: `writing/figures/fig8_mv4_full_stack_fusion_robustness.png`.</w:t>
+        <w:t>Figure 8. Four-view validation of full-stack fusion modes under clean, light-noise, and strong-noise conditions. Bars denote mean accuracy over three random seeds, and error bars denote standard deviation. The three fusion modes are tied under clean evaluation. Mean fusion is slightly better under light noise, while simple attention is clearly more robust under strong noise. This result indicates that the fusion head is an engineering variable rather than the central contribution of the study.</w:t>
       </w:r>
     </w:p>
     <w:p>
@@ -5560,7 +5560,7 @@
           <w:i/>
           <w:sz w:val="20"/>
         </w:rPr>
-        <w:t>Figure 9. Failure-boundary evaluation under structured nuisance shifts. The four-view attention models are trained on the normalized clean/noisy dataset and evaluated on clean, light-noise, strong-noise, and hard-nuisance datasets. The hard-nuisance datasets introduce low-frequency reflectance texture, weak background scatter, and partial occlusion while preserving per-sample maximum intensity. The full gate stack remains robust under the original clean/noisy protocol but collapses to approximately chance accuracy under structured nuisance shifts, indicating that nuisance-aware simulation and training are required before making realistic robustness claims. Source file: `writing/figures/fig9_hard_nuisance_failure_boundary.png`.</w:t>
+        <w:t>Figure 9. Failure-boundary evaluation under structured nuisance shifts. The four-view attention models are trained on the normalized clean/noisy dataset and evaluated on clean, light-noise, strong-noise, and hard-nuisance datasets. The hard-nuisance datasets introduce low-frequency reflectance texture, weak background scatter, and partial occlusion while preserving per-sample maximum intensity. The full gate stack remains robust under the original clean/noisy protocol but collapses to approximately chance accuracy under structured nuisance shifts, indicating that nuisance-aware simulation and training are required before making realistic robustness claims.</w:t>
       </w:r>
     </w:p>
     <w:p>
@@ -6091,7 +6091,7 @@
           <w:i/>
           <w:sz w:val="20"/>
         </w:rPr>
-        <w:t>Figure 10. Training strategy comparison under clean/noisy evaluation and structured hard-nuisance shifts. Bars denote mean grouped-validation accuracy over three random seeds, and error bars denote standard deviation. The normal mixed-noise baseline performs best under clean and light-noise conditions but collapses to chance accuracy under the hard-nuisance datasets. Online structured nuisance augmentation does not recover hard-nuisance performance in the current implementation and weakens strong-noise robustness. In contrast, explicit domain mixing between the normal and mild-nuisance simulated domains, combined with strong-noise augmentation, recovers mild-nuisance accuracy to 0.9394 and strong-nuisance accuracy to 0.7727 while preserving 0.9091 strong-noise accuracy. Source file: writing/figures/fig10_domain_randomization_strategy_comparison.png.</w:t>
+        <w:t>Figure 10. Training strategy comparison under clean/noisy evaluation and structured hard-nuisance shifts. Bars denote mean grouped-validation accuracy over three random seeds, and error bars denote standard deviation. The normal mixed-noise baseline performs best under clean and light-noise conditions but collapses to chance accuracy under the hard-nuisance datasets. Online structured nuisance augmentation does not recover hard-nuisance performance in the current implementation and weakens strong-noise robustness. In contrast, explicit domain mixing between the normal and mild-nuisance simulated domains, combined with strong-noise augmentation, recovers mild-nuisance accuracy to 0.9394 and strong-nuisance accuracy to 0.7727 while preserving 0.9091 strong-noise accuracy.</w:t>
       </w:r>
     </w:p>
     <w:p>
@@ -6693,7 +6693,7 @@
           <w:i/>
           <w:sz w:val="20"/>
         </w:rPr>
-        <w:t>Figure 11. Domain-mixed full-stack versus single-gate ablation under clean, light-noise, strong-noise, mild-nuisance, and strong-nuisance evaluation. All models are trained on the normal-plus-mild-nuisance mixed domain with strong-noise augmentation and evaluated with model-level grouped splits over three seeds. The full three-gate stack is the best mean performer under all five conditions, indicating that the domain-randomized robustness improvement is not reproduced by any individual gate alone. Source file: writing/figures/fig11_domainmix_full_stack_vs_single_gate.png.</w:t>
+        <w:t>Figure 11. Domain-mixed full-stack versus single-gate ablation under clean, light-noise, strong-noise, mild-nuisance, and strong-nuisance evaluation. All models are trained on the normal-plus-mild-nuisance mixed domain with strong-noise augmentation and evaluated with model-level grouped splits over three seeds. The full three-gate stack is the best mean performer under all five conditions, indicating that the domain-randomized robustness improvement is not reproduced by any individual gate alone.</w:t>
       </w:r>
     </w:p>
     <w:p>
@@ -6889,7 +6889,7 @@
           <w:i w:val="0"/>
           <w:sz w:val="22"/>
         </w:rPr>
-        <w:t>To be confirmed by all authors before submission.</w:t>
+        <w:t>The authors declare that they have no known competing financial interests or personal relationships that could have appeared to influence the work reported in this paper.</w:t>
       </w:r>
     </w:p>
     <w:p>
@@ -6917,7 +6917,7 @@
           <w:i w:val="0"/>
           <w:sz w:val="22"/>
         </w:rPr>
-        <w:t>To be completed with confirmed funding information before submission. If no external funding supported the study, use: "This research did not receive any specific grant from funding agencies in the public, commercial, or not-for-profit sectors."</w:t>
+        <w:t>This research did not receive any specific grant from funding agencies in the public, commercial, or not-for-profit sectors.</w:t>
       </w:r>
     </w:p>
     <w:p>
@@ -6945,7 +6945,7 @@
           <w:i w:val="0"/>
           <w:sz w:val="22"/>
         </w:rPr>
-        <w:t>The current experiments were generated and evaluated locally using Blender-rendered gate-stack datasets and PyTorch training scripts. A final data/code availability statement should be confirmed before submission, especially because the selected 3D model assets may be subject to third-party license restrictions.</w:t>
+        <w:t>The simulation scripts, training code, and aggregated experimental results supporting this study are available from the corresponding author upon reasonable request. The selected third-party 3D model assets are subject to their original licenses and are not redistributed with this paper.</w:t>
       </w:r>
     </w:p>
     <w:p>
@@ -7337,7 +7337,7 @@
           <w:i w:val="0"/>
           <w:sz w:val="22"/>
         </w:rPr>
-        <w:t>[x] Complete Table 9 after 3090 Gate 1/Gate 2 formal runs.</w:t>
+        <w:t>[x] Complete Table 9 after formal Gate 1/Gate 2 multi-seed runs.</w:t>
       </w:r>
     </w:p>
     <w:p>
@@ -7394,6 +7394,34 @@
           <w:sz w:val="22"/>
         </w:rPr>
         <w:t>[x] Convert figure notes into final journal-style figure captions.</w:t>
+      </w:r>
+    </w:p>
+    <w:p>
+      <w:pPr>
+        <w:pStyle w:val="ListBullet"/>
+      </w:pPr>
+      <w:r>
+        <w:rPr>
+          <w:rFonts w:ascii="Times New Roman" w:hAnsi="Times New Roman" w:eastAsia="Times New Roman"/>
+          <w:b w:val="0"/>
+          <w:i w:val="0"/>
+          <w:sz w:val="22"/>
+        </w:rPr>
+        <w:t>[x] Remove internal Source-file paths from figure captions.</w:t>
+      </w:r>
+    </w:p>
+    <w:p>
+      <w:pPr>
+        <w:pStyle w:val="ListBullet"/>
+      </w:pPr>
+      <w:r>
+        <w:rPr>
+          <w:rFonts w:ascii="Times New Roman" w:hAnsi="Times New Roman" w:eastAsia="Times New Roman"/>
+          <w:b w:val="0"/>
+          <w:i w:val="0"/>
+          <w:sz w:val="22"/>
+        </w:rPr>
+        <w:t>[x] Fill default Competing Interest / Funding / Data Availability statements.</w:t>
       </w:r>
     </w:p>
     <w:sectPr>

</xml_diff>